<commit_message>
refactorizacion del orden de sim de rx
</commit_message>
<xml_diff>
--- a/CAMBRIDGE/bitacora/B_Bitacora_Completa.docx
+++ b/CAMBRIDGE/bitacora/B_Bitacora_Completa.docx
@@ -3525,6 +3525,109 @@
         <w:lastRenderedPageBreak/>
         <w:t>Revisa que todos los paraemtros sean configurables y además debe haber un boton al final para guardar esa configuración, porque quiero ajustar todo visualmente y despues guardarlo; de ese modo esa scena la proxima vez que la seleccione tomará los parametros que guarde.</w:t>
       </w:r>
+    </w:p>
+    <w:p>
+      <w:pPr>
+        <w:pStyle w:val="NoSpacing"/>
+        <w:rPr>
+          <w:rFonts w:ascii="Arial" w:hAnsi="Arial" w:cs="Arial"/>
+        </w:rPr>
+      </w:pPr>
+    </w:p>
+    <w:p>
+      <w:pPr>
+        <w:pStyle w:val="NoSpacing"/>
+        <w:rPr>
+          <w:rFonts w:ascii="Arial" w:hAnsi="Arial" w:cs="Arial"/>
+        </w:rPr>
+      </w:pPr>
+    </w:p>
+    <w:p>
+      <w:pPr>
+        <w:pStyle w:val="NoSpacing"/>
+        <w:jc w:val="right"/>
+        <w:rPr>
+          <w:rFonts w:ascii="Arial" w:hAnsi="Arial" w:cs="Arial"/>
+          <w:b/>
+          <w:bCs/>
+        </w:rPr>
+      </w:pPr>
+      <w:r>
+        <w:rPr>
+          <w:rFonts w:ascii="Arial" w:hAnsi="Arial" w:cs="Arial"/>
+          <w:b/>
+          <w:bCs/>
+        </w:rPr>
+        <w:t>14/09/2026</w:t>
+      </w:r>
+    </w:p>
+    <w:p>
+      <w:pPr>
+        <w:pStyle w:val="NoSpacing"/>
+        <w:rPr>
+          <w:rFonts w:ascii="Arial" w:hAnsi="Arial" w:cs="Arial"/>
+          <w:b/>
+          <w:bCs/>
+        </w:rPr>
+      </w:pPr>
+    </w:p>
+    <w:p>
+      <w:pPr>
+        <w:pStyle w:val="NoSpacing"/>
+        <w:rPr>
+          <w:rFonts w:ascii="Arial" w:hAnsi="Arial" w:cs="Arial"/>
+          <w:b/>
+          <w:bCs/>
+          <w:color w:val="4C94D8" w:themeColor="text2" w:themeTint="80"/>
+        </w:rPr>
+      </w:pPr>
+      <w:r>
+        <w:rPr>
+          <w:rFonts w:ascii="Arial" w:hAnsi="Arial" w:cs="Arial"/>
+          <w:b/>
+          <w:bCs/>
+          <w:color w:val="4C94D8" w:themeColor="text2" w:themeTint="80"/>
+        </w:rPr>
+        <w:t>Estimación en el receptor mediante reorientaciones</w:t>
+      </w:r>
+    </w:p>
+    <w:p>
+      <w:pPr>
+        <w:pStyle w:val="NoSpacing"/>
+        <w:rPr>
+          <w:rFonts w:ascii="Arial" w:hAnsi="Arial" w:cs="Arial"/>
+          <w:b/>
+          <w:bCs/>
+        </w:rPr>
+      </w:pPr>
+    </w:p>
+    <w:p>
+      <w:pPr>
+        <w:pStyle w:val="NoSpacing"/>
+        <w:rPr>
+          <w:rFonts w:ascii="Arial" w:hAnsi="Arial" w:cs="Arial"/>
+          <w:b/>
+          <w:bCs/>
+        </w:rPr>
+      </w:pPr>
+    </w:p>
+    <w:p>
+      <w:pPr>
+        <w:pStyle w:val="NoSpacing"/>
+        <w:rPr>
+          <w:rFonts w:ascii="Arial" w:hAnsi="Arial" w:cs="Arial"/>
+          <w:b/>
+          <w:bCs/>
+        </w:rPr>
+      </w:pPr>
+    </w:p>
+    <w:p>
+      <w:pPr>
+        <w:pStyle w:val="NoSpacing"/>
+        <w:rPr>
+          <w:rFonts w:ascii="Arial" w:hAnsi="Arial" w:cs="Arial"/>
+        </w:rPr>
+      </w:pPr>
     </w:p>
     <w:sectPr>
       <w:pgSz w:w="11906" w:h="16838" w:code="9"/>

</xml_diff>